<commit_message>
AprilTags are deployed: update the report and README
The 30 tags are printed and placed on the map, and /localize was
verified on the robot -- it returns the correct tile for the tag in
view. Both documents still described this as pending.

Report:
- Section 10 drops the "print and physically place the 30 AprilTags"
  item, now done.
- Section 11 says the localization system is deployed and verified
  rather than "complete in software and awaiting physical deployment".
- Section 8 records the deployment and the endpoint check, keeping the
  caveat that route progression is still stop-line counting.
- The abstract claimed the robot reads its starting tile "and facing"
  from the tag, which contradicted Section 8 -- facing is deliberately
  not derived from tag geometry. Dropped the facing claim.

README: the "AprilTags are not physically placed yet" limitation is
gone, folded into the remaining one about position being displayed but
not used for correction.
</commit_message>
<xml_diff>
--- a/report/Final_Report.docx
+++ b/report/Final_Report.docx
@@ -227,7 +227,7 @@
           <w:sz w:val="20"/>
           <w:szCs w:val="20"/>
         </w:rPr>
-        <w:t xml:space="preserve"> This project implements autonomous grid navigation for a Duckiebot: given only a destination, the robot locates its own starting tile and facing by reading an AprilTag, plans a route with A* search, and drives that route end to end — following its lane by camera, stopping at every red line, executing the correct turn at each intersection, and steering around obstacles with a time-of-flight range sensor. The official indefinite_navigation demo does not run on this robot due to a base-software version mismatch, so the full navigation stack was built independently. All 1980 possible start-to-destination routes on the project's 7×6 tile map were verified to produce well-formed, U-turn-free plans. Two camera-based obstacle detectors were attempted and rejected on measured evidence before a range sensor was adopted, and this negative result is reported alongside the working system.</w:t>
+        <w:t xml:space="preserve"> This project implements autonomous grid navigation for a Duckiebot: given only a destination, the robot locates its own starting tile by reading an AprilTag, plans a route with A* search, and drives that route end to end — following its lane by camera, stopping at every red line, executing the correct turn at each intersection, and steering around obstacles with a time-of-flight range sensor. The official indefinite_navigation demo does not run on this robot due to a base-software version mismatch, so the full navigation stack was built independently. All 1980 possible start-to-destination routes on the project's 7×6 tile map were verified to produce well-formed, U-turn-free plans. Two camera-based obstacle detectors were attempted and rejected on measured evidence before a range sensor was adopted, and this negative result is reported alongside the working system.</w:t>
       </w:r>
     </w:p>
     <w:p>
@@ -946,7 +946,7 @@
           <w:sz w:val="20"/>
           <w:szCs w:val="20"/>
         </w:rPr>
-        <w:t xml:space="preserve">An AprilTag-based localization system removes the need to manually specify a starting tile. A lookup table maps each of 30 road tiles to a unique tag ID; on request, the navigator samples up to five frames and takes a majority vote across detections, more robust to a single misread frame than trusting one detection outright. Facing is deliberately not derived from tag geometry, since it could not be estimated reliably enough at the distances involved to be trustworthy. A throttled continuous variant (~5 detections/s, to avoid competing with lane following for compute) provides live position tracking on the browser map while driving; a lock around the underlying (non-thread-safe) detection library prevents the continuous tracking loop and the one-shot localization endpoint from corrupting shared state if called concurrently. Route progression itself, however, is still governed by counting stop lines rather than by tag position — tag position is displayed, not yet used for correction.</w:t>
+        <w:t xml:space="preserve">An AprilTag-based localization system removes the need to manually specify a starting tile. A lookup table maps each of 30 road tiles to a unique tag ID; on request, the navigator samples up to five frames and takes a majority vote across detections, more robust to a single misread frame than trusting one detection outright. Facing is deliberately not derived from tag geometry, since it could not be estimated reliably enough at the distances involved to be trustworthy. A throttled continuous variant (~5 detections/s, to avoid competing with lane following for compute) provides live position tracking on the browser map while driving; a lock around the underlying (non-thread-safe) detection library prevents the continuous tracking loop and the one-shot localization endpoint from corrupting shared state if called concurrently. The 30 tags are printed and placed on the map, and the endpoint was verified on the robot: a /localize request returns the correct tile for the tag in view. Route progression itself, however, is still governed by counting stop lines rather than by tag position — tag position is displayed, not yet used for correction.</w:t>
       </w:r>
     </w:p>
     <w:p>
@@ -1057,7 +1057,7 @@
           <w:sz w:val="20"/>
           <w:szCs w:val="20"/>
         </w:rPr>
-        <w:t xml:space="preserve">Print and physically place the 30 AprilTags, validating each with the included standalone detection test script.</w:t>
+        <w:t xml:space="preserve">Use AprilTag position to correct route progression when it disagrees with the stop-line count, rather than only displaying position.</w:t>
       </w:r>
     </w:p>
     <w:p>
@@ -1076,7 +1076,7 @@
           <w:sz w:val="20"/>
           <w:szCs w:val="20"/>
         </w:rPr>
-        <w:t xml:space="preserve">Use AprilTag position to correct route progression when it disagrees with the stop-line count, rather than only displaying position.</w:t>
+        <w:t xml:space="preserve">Incorporate wheel-encoder feedback for closed-loop turn completion, rather than terminating on lane visibility alone.</w:t>
       </w:r>
     </w:p>
     <w:p>
@@ -1095,25 +1095,6 @@
           <w:sz w:val="20"/>
           <w:szCs w:val="20"/>
         </w:rPr>
-        <w:t xml:space="preserve">Incorporate wheel-encoder feedback for closed-loop turn completion, rather than terminating on lane visibility alone.</w:t>
-      </w:r>
-    </w:p>
-    <w:p>
-      <w:pPr>
-        <w:pStyle w:val="ListParagraph"/>
-        <w:numPr>
-          <w:ilvl w:val="0"/>
-          <w:numId w:val="2"/>
-        </w:numPr>
-        <w:spacing w:after="80"/>
-        <w:jc w:val="both"/>
-      </w:pPr>
-      <w:r>
-        <w:rPr>
-          <w:rFonts w:ascii="Times New Roman" w:cs="Times New Roman" w:eastAsia="Times New Roman" w:hAnsi="Times New Roman"/>
-          <w:sz w:val="20"/>
-          <w:szCs w:val="20"/>
-        </w:rPr>
         <w:t xml:space="preserve">Extend the range sensor to a stop-and-wait behaviour in addition to the existing swerve.</w:t>
       </w:r>
     </w:p>
@@ -1143,7 +1124,7 @@
           <w:sz w:val="20"/>
           <w:szCs w:val="20"/>
         </w:rPr>
-        <w:t xml:space="preserve">This project delivers a complete, exhaustively verified pipeline from destination selection to autonomous arrival: route planning validated across all 1980 possible routes, a measured and corrected lane-following bug, self-correcting intersection turns, sensor-based obstacle avoidance adopted after two documented visual approaches were shown to fail on real data, and a self-localization system complete in software and awaiting physical deployment. Design decisions throughout were grounded in measurement — pixel positions, elongation ratios, range thresholds — and the system's remaining limitations are reported explicitly rather than understated.</w:t>
+        <w:t xml:space="preserve">This project delivers a complete, exhaustively verified pipeline from destination selection to autonomous arrival: route planning validated across all 1980 possible routes, a measured and corrected lane-following bug, self-correcting intersection turns, sensor-based obstacle avoidance adopted after two documented visual approaches were shown to fail on real data, and a self-localization system deployed on the map and verified on the robot. Design decisions throughout were grounded in measurement — pixel positions, elongation ratios, range thresholds — and the system's remaining limitations are reported explicitly rather than understated.</w:t>
       </w:r>
     </w:p>
     <w:p>

</xml_diff>